<commit_message>
chore: limpieza de repo, destrackeo vendor/logs/uploads y commit de código acumulado
- Destrackea vendor/ (3800), logs/ (44) y uploads/ (9): siguen en disco y .gitignore los excluye; dependencias resueltas vía composer.json/composer.lock
- Destrackea .env y .env.production (secretos) para que no vuelvan al repo
- Agrega .gitignore ampliado: node-bin/, backups/, data/, .opencode/node_modules/, caches, temporales y scripts de prueba
- Elimina del control de versiones respaldos SQL antiguos y caches (.phpunit.result.cache, tests/logs/phpunit.log)
- Commitea trabajo acumulado: controladores nuevos (Marcaciones, MenuConfig, ResumenJustificaciones), modelos, servicios, vistas, migraciones, scripts sql/, tests (Unit/Functional/Integration/Security), assets locales, docs y .opencode (skills openspec + MCP)
</commit_message>
<xml_diff>
--- a/DOCUMENTACION_PROYECTO_FINAL.docx
+++ b/DOCUMENTACION_PROYECTO_FINAL.docx
@@ -90,7 +90,7 @@
       </w:pPr>
       <w:r>
         <w:rPr>
-          <w:rStyle w:val="Textoennegrita"/>
+          <w:rStyle w:val="Fuerte"/>
           <w:rFonts w:ascii="Calibri" w:hAnsi="Calibri" w:cs="Calibri"/>
           <w:color w:val="888888"/>
         </w:rPr>
@@ -116,7 +116,7 @@
       </w:pPr>
       <w:r>
         <w:rPr>
-          <w:rStyle w:val="Textoennegrita"/>
+          <w:rStyle w:val="Fuerte"/>
           <w:rFonts w:ascii="Calibri" w:hAnsi="Calibri" w:cs="Calibri"/>
           <w:color w:val="888888"/>
         </w:rPr>
@@ -127,7 +127,14 @@
           <w:rFonts w:ascii="Calibri" w:hAnsi="Calibri" w:cs="Calibri"/>
           <w:color w:val="888888"/>
         </w:rPr>
-        <w:t xml:space="preserve"> 26 de Noviembre de 2025</w:t>
+        <w:t xml:space="preserve"> 26 de Noviembre de 202</w:t>
+      </w:r>
+      <w:r>
+        <w:rPr>
+          <w:rFonts w:ascii="Calibri" w:hAnsi="Calibri" w:cs="Calibri"/>
+          <w:color w:val="888888"/>
+        </w:rPr>
+        <w:t>6</w:t>
       </w:r>
     </w:p>
     <w:p>
@@ -142,7 +149,7 @@
       </w:pPr>
       <w:r>
         <w:rPr>
-          <w:rStyle w:val="Textoennegrita"/>
+          <w:rStyle w:val="Fuerte"/>
           <w:rFonts w:ascii="Calibri" w:hAnsi="Calibri" w:cs="Calibri"/>
           <w:color w:val="888888"/>
         </w:rPr>
@@ -182,7 +189,7 @@
       </w:pPr>
       <w:r>
         <w:rPr>
-          <w:rStyle w:val="Textoennegrita"/>
+          <w:rStyle w:val="Fuerte"/>
           <w:rFonts w:ascii="Calibri" w:hAnsi="Calibri" w:cs="Calibri"/>
           <w:color w:val="888888"/>
         </w:rPr>
@@ -645,7 +652,7 @@
       </w:pPr>
       <w:r>
         <w:rPr>
-          <w:rStyle w:val="Textoennegrita"/>
+          <w:rStyle w:val="Fuerte"/>
           <w:rFonts w:ascii="Calibri" w:hAnsi="Calibri" w:cs="Calibri"/>
           <w:color w:val="333333"/>
         </w:rPr>
@@ -1714,7 +1721,7 @@
       </w:pPr>
       <w:r>
         <w:rPr>
-          <w:rStyle w:val="Textoennegrita"/>
+          <w:rStyle w:val="Fuerte"/>
           <w:rFonts w:ascii="Calibri" w:eastAsia="Times New Roman" w:hAnsi="Calibri" w:cs="Calibri"/>
           <w:color w:val="333333"/>
         </w:rPr>
@@ -1745,7 +1752,7 @@
       </w:pPr>
       <w:r>
         <w:rPr>
-          <w:rStyle w:val="Textoennegrita"/>
+          <w:rStyle w:val="Fuerte"/>
           <w:rFonts w:ascii="Calibri" w:eastAsia="Times New Roman" w:hAnsi="Calibri" w:cs="Calibri"/>
           <w:color w:val="333333"/>
         </w:rPr>
@@ -1776,7 +1783,7 @@
       </w:pPr>
       <w:r>
         <w:rPr>
-          <w:rStyle w:val="Textoennegrita"/>
+          <w:rStyle w:val="Fuerte"/>
           <w:rFonts w:ascii="Calibri" w:eastAsia="Times New Roman" w:hAnsi="Calibri" w:cs="Calibri"/>
           <w:color w:val="333333"/>
         </w:rPr>
@@ -1807,7 +1814,7 @@
       </w:pPr>
       <w:r>
         <w:rPr>
-          <w:rStyle w:val="Textoennegrita"/>
+          <w:rStyle w:val="Fuerte"/>
           <w:rFonts w:ascii="Calibri" w:eastAsia="Times New Roman" w:hAnsi="Calibri" w:cs="Calibri"/>
           <w:color w:val="333333"/>
         </w:rPr>
@@ -1839,7 +1846,7 @@
       </w:pPr>
       <w:r>
         <w:rPr>
-          <w:rStyle w:val="Textoennegrita"/>
+          <w:rStyle w:val="Fuerte"/>
           <w:rFonts w:ascii="Calibri" w:eastAsia="Times New Roman" w:hAnsi="Calibri" w:cs="Calibri"/>
           <w:color w:val="333333"/>
           <w:lang w:val="en-US"/>
@@ -1956,7 +1963,7 @@
       </w:pPr>
       <w:r>
         <w:rPr>
-          <w:rStyle w:val="Textoennegrita"/>
+          <w:rStyle w:val="Fuerte"/>
           <w:rFonts w:ascii="Calibri" w:eastAsia="Times New Roman" w:hAnsi="Calibri" w:cs="Calibri"/>
           <w:color w:val="333333"/>
         </w:rPr>
@@ -1987,7 +1994,7 @@
       </w:pPr>
       <w:r>
         <w:rPr>
-          <w:rStyle w:val="Textoennegrita"/>
+          <w:rStyle w:val="Fuerte"/>
           <w:rFonts w:ascii="Calibri" w:eastAsia="Times New Roman" w:hAnsi="Calibri" w:cs="Calibri"/>
           <w:color w:val="333333"/>
         </w:rPr>
@@ -2018,7 +2025,7 @@
       </w:pPr>
       <w:r>
         <w:rPr>
-          <w:rStyle w:val="Textoennegrita"/>
+          <w:rStyle w:val="Fuerte"/>
           <w:rFonts w:ascii="Calibri" w:eastAsia="Times New Roman" w:hAnsi="Calibri" w:cs="Calibri"/>
           <w:color w:val="333333"/>
         </w:rPr>
@@ -2049,7 +2056,7 @@
       </w:pPr>
       <w:r>
         <w:rPr>
-          <w:rStyle w:val="Textoennegrita"/>
+          <w:rStyle w:val="Fuerte"/>
           <w:rFonts w:ascii="Calibri" w:eastAsia="Times New Roman" w:hAnsi="Calibri" w:cs="Calibri"/>
           <w:color w:val="333333"/>
         </w:rPr>
@@ -2080,7 +2087,7 @@
       </w:pPr>
       <w:r>
         <w:rPr>
-          <w:rStyle w:val="Textoennegrita"/>
+          <w:rStyle w:val="Fuerte"/>
           <w:rFonts w:ascii="Calibri" w:eastAsia="Times New Roman" w:hAnsi="Calibri" w:cs="Calibri"/>
           <w:color w:val="333333"/>
         </w:rPr>
@@ -2111,7 +2118,7 @@
       </w:pPr>
       <w:r>
         <w:rPr>
-          <w:rStyle w:val="Textoennegrita"/>
+          <w:rStyle w:val="Fuerte"/>
           <w:rFonts w:ascii="Calibri" w:eastAsia="Times New Roman" w:hAnsi="Calibri" w:cs="Calibri"/>
           <w:color w:val="333333"/>
         </w:rPr>
@@ -2243,29 +2250,33 @@
         <w:divId w:val="352464823"/>
         <w:rPr>
           <w:color w:val="333333"/>
+        </w:rPr>
+      </w:pPr>
+      <w:r>
+        <w:rPr>
+          <w:color w:val="333333"/>
           <w:lang w:val="en-US"/>
         </w:rPr>
-      </w:pPr>
-      <w:r>
-        <w:rPr>
-          <w:color w:val="333333"/>
-          <w:lang w:val="en-US"/>
-        </w:rPr>
-        <w:t xml:space="preserve">            ↓</w:t>
-      </w:r>
-    </w:p>
-    <w:p>
-      <w:pPr>
-        <w:pStyle w:val="HTMLconformatoprevio"/>
-        <w:divId w:val="352464823"/>
-        <w:rPr>
-          <w:color w:val="333333"/>
-        </w:rPr>
-      </w:pPr>
-      <w:r>
-        <w:rPr>
-          <w:color w:val="333333"/>
-          <w:lang w:val="en-US"/>
+        <w:t xml:space="preserve">            </w:t>
+      </w:r>
+      <w:r>
+        <w:rPr>
+          <w:color w:val="333333"/>
+        </w:rPr>
+        <w:t>↓</w:t>
+      </w:r>
+    </w:p>
+    <w:p>
+      <w:pPr>
+        <w:pStyle w:val="HTMLconformatoprevio"/>
+        <w:divId w:val="352464823"/>
+        <w:rPr>
+          <w:color w:val="333333"/>
+        </w:rPr>
+      </w:pPr>
+      <w:r>
+        <w:rPr>
+          <w:color w:val="333333"/>
         </w:rPr>
         <w:t xml:space="preserve">        </w:t>
       </w:r>
@@ -6086,7 +6097,7 @@
       </w:pPr>
       <w:r>
         <w:rPr>
-          <w:rStyle w:val="Textoennegrita"/>
+          <w:rStyle w:val="Fuerte"/>
           <w:rFonts w:ascii="Calibri" w:eastAsia="Times New Roman" w:hAnsi="Calibri" w:cs="Calibri"/>
           <w:color w:val="333333"/>
         </w:rPr>
@@ -6117,7 +6128,7 @@
       </w:pPr>
       <w:r>
         <w:rPr>
-          <w:rStyle w:val="Textoennegrita"/>
+          <w:rStyle w:val="Fuerte"/>
           <w:rFonts w:ascii="Calibri" w:eastAsia="Times New Roman" w:hAnsi="Calibri" w:cs="Calibri"/>
           <w:color w:val="333333"/>
         </w:rPr>
@@ -6148,7 +6159,7 @@
       </w:pPr>
       <w:r>
         <w:rPr>
-          <w:rStyle w:val="Textoennegrita"/>
+          <w:rStyle w:val="Fuerte"/>
           <w:rFonts w:ascii="Calibri" w:eastAsia="Times New Roman" w:hAnsi="Calibri" w:cs="Calibri"/>
           <w:color w:val="333333"/>
         </w:rPr>
@@ -6180,7 +6191,7 @@
       </w:pPr>
       <w:r>
         <w:rPr>
-          <w:rStyle w:val="Textoennegrita"/>
+          <w:rStyle w:val="Fuerte"/>
           <w:rFonts w:ascii="Calibri" w:eastAsia="Times New Roman" w:hAnsi="Calibri" w:cs="Calibri"/>
           <w:color w:val="333333"/>
         </w:rPr>
@@ -6211,7 +6222,7 @@
       </w:pPr>
       <w:r>
         <w:rPr>
-          <w:rStyle w:val="Textoennegrita"/>
+          <w:rStyle w:val="Fuerte"/>
           <w:rFonts w:ascii="Calibri" w:eastAsia="Times New Roman" w:hAnsi="Calibri" w:cs="Calibri"/>
           <w:color w:val="333333"/>
         </w:rPr>
@@ -6242,7 +6253,7 @@
       </w:pPr>
       <w:r>
         <w:rPr>
-          <w:rStyle w:val="Textoennegrita"/>
+          <w:rStyle w:val="Fuerte"/>
           <w:rFonts w:ascii="Calibri" w:eastAsia="Times New Roman" w:hAnsi="Calibri" w:cs="Calibri"/>
           <w:color w:val="333333"/>
         </w:rPr>
@@ -6273,7 +6284,7 @@
       </w:pPr>
       <w:r>
         <w:rPr>
-          <w:rStyle w:val="Textoennegrita"/>
+          <w:rStyle w:val="Fuerte"/>
           <w:rFonts w:ascii="Calibri" w:eastAsia="Times New Roman" w:hAnsi="Calibri" w:cs="Calibri"/>
           <w:color w:val="333333"/>
         </w:rPr>
@@ -6304,7 +6315,7 @@
       </w:pPr>
       <w:r>
         <w:rPr>
-          <w:rStyle w:val="Textoennegrita"/>
+          <w:rStyle w:val="Fuerte"/>
           <w:rFonts w:ascii="Calibri" w:eastAsia="Times New Roman" w:hAnsi="Calibri" w:cs="Calibri"/>
           <w:color w:val="333333"/>
         </w:rPr>
@@ -6335,7 +6346,7 @@
       </w:pPr>
       <w:r>
         <w:rPr>
-          <w:rStyle w:val="Textoennegrita"/>
+          <w:rStyle w:val="Fuerte"/>
           <w:rFonts w:ascii="Calibri" w:eastAsia="Times New Roman" w:hAnsi="Calibri" w:cs="Calibri"/>
           <w:color w:val="333333"/>
         </w:rPr>
@@ -6366,7 +6377,7 @@
       </w:pPr>
       <w:r>
         <w:rPr>
-          <w:rStyle w:val="Textoennegrita"/>
+          <w:rStyle w:val="Fuerte"/>
           <w:rFonts w:ascii="Calibri" w:eastAsia="Times New Roman" w:hAnsi="Calibri" w:cs="Calibri"/>
           <w:color w:val="333333"/>
         </w:rPr>
@@ -6397,7 +6408,7 @@
       </w:pPr>
       <w:r>
         <w:rPr>
-          <w:rStyle w:val="Textoennegrita"/>
+          <w:rStyle w:val="Fuerte"/>
           <w:rFonts w:ascii="Calibri" w:eastAsia="Times New Roman" w:hAnsi="Calibri" w:cs="Calibri"/>
           <w:color w:val="333333"/>
         </w:rPr>
@@ -6428,7 +6439,7 @@
       </w:pPr>
       <w:r>
         <w:rPr>
-          <w:rStyle w:val="Textoennegrita"/>
+          <w:rStyle w:val="Fuerte"/>
           <w:rFonts w:ascii="Calibri" w:eastAsia="Times New Roman" w:hAnsi="Calibri" w:cs="Calibri"/>
           <w:color w:val="333333"/>
         </w:rPr>
@@ -6833,18 +6844,20 @@
         <w:divId w:val="352464823"/>
         <w:rPr>
           <w:color w:val="333333"/>
-        </w:rPr>
-      </w:pPr>
-      <w:r>
-        <w:rPr>
-          <w:color w:val="333333"/>
           <w:lang w:val="en-US"/>
         </w:rPr>
+      </w:pPr>
+      <w:r>
+        <w:rPr>
+          <w:color w:val="333333"/>
+          <w:lang w:val="en-US"/>
+        </w:rPr>
         <w:t xml:space="preserve">        </w:t>
       </w:r>
       <w:r>
         <w:rPr>
           <w:color w:val="333333"/>
+          <w:lang w:val="en-US"/>
         </w:rPr>
         <w:t>- nombre VARCHAR(100) NOT NULL</w:t>
       </w:r>
@@ -6855,11 +6868,13 @@
         <w:divId w:val="352464823"/>
         <w:rPr>
           <w:color w:val="333333"/>
-        </w:rPr>
-      </w:pPr>
-      <w:r>
-        <w:rPr>
-          <w:color w:val="333333"/>
+          <w:lang w:val="en-US"/>
+        </w:rPr>
+      </w:pPr>
+      <w:r>
+        <w:rPr>
+          <w:color w:val="333333"/>
+          <w:lang w:val="en-US"/>
         </w:rPr>
         <w:t xml:space="preserve">        - apellido VARCHAR(100) NOT NULL</w:t>
       </w:r>
@@ -6876,6 +6891,7 @@
       <w:r>
         <w:rPr>
           <w:color w:val="333333"/>
+          <w:lang w:val="en-US"/>
         </w:rPr>
         <w:t xml:space="preserve">        </w:t>
       </w:r>
@@ -6927,29 +6943,33 @@
         <w:divId w:val="352464823"/>
         <w:rPr>
           <w:color w:val="333333"/>
+        </w:rPr>
+      </w:pPr>
+      <w:r>
+        <w:rPr>
+          <w:color w:val="333333"/>
           <w:lang w:val="en-US"/>
         </w:rPr>
-      </w:pPr>
-      <w:r>
-        <w:rPr>
-          <w:color w:val="333333"/>
-          <w:lang w:val="en-US"/>
-        </w:rPr>
-        <w:t xml:space="preserve">        - jerarquia VARCHAR(50) NOT NULL</w:t>
-      </w:r>
-    </w:p>
-    <w:p>
-      <w:pPr>
-        <w:pStyle w:val="HTMLconformatoprevio"/>
-        <w:divId w:val="352464823"/>
-        <w:rPr>
-          <w:color w:val="333333"/>
-        </w:rPr>
-      </w:pPr>
-      <w:r>
-        <w:rPr>
-          <w:color w:val="333333"/>
-          <w:lang w:val="en-US"/>
+        <w:t xml:space="preserve">        </w:t>
+      </w:r>
+      <w:r>
+        <w:rPr>
+          <w:color w:val="333333"/>
+        </w:rPr>
+        <w:t>- jerarquia VARCHAR(50) NOT NULL</w:t>
+      </w:r>
+    </w:p>
+    <w:p>
+      <w:pPr>
+        <w:pStyle w:val="HTMLconformatoprevio"/>
+        <w:divId w:val="352464823"/>
+        <w:rPr>
+          <w:color w:val="333333"/>
+        </w:rPr>
+      </w:pPr>
+      <w:r>
+        <w:rPr>
+          <w:color w:val="333333"/>
         </w:rPr>
         <w:t xml:space="preserve">        </w:t>
       </w:r>
@@ -7940,7 +7960,7 @@
       </w:pPr>
       <w:r>
         <w:rPr>
-          <w:rStyle w:val="Textoennegrita"/>
+          <w:rStyle w:val="Fuerte"/>
           <w:rFonts w:ascii="Calibri" w:eastAsia="Times New Roman" w:hAnsi="Calibri" w:cs="Calibri"/>
           <w:color w:val="333333"/>
         </w:rPr>
@@ -8856,7 +8876,7 @@
       </w:pPr>
       <w:r>
         <w:rPr>
-          <w:rStyle w:val="Textoennegrita"/>
+          <w:rStyle w:val="Fuerte"/>
           <w:rFonts w:ascii="Calibri" w:eastAsia="Times New Roman" w:hAnsi="Calibri" w:cs="Calibri"/>
           <w:color w:val="333333"/>
         </w:rPr>
@@ -8887,7 +8907,7 @@
       </w:pPr>
       <w:r>
         <w:rPr>
-          <w:rStyle w:val="Textoennegrita"/>
+          <w:rStyle w:val="Fuerte"/>
           <w:rFonts w:ascii="Calibri" w:eastAsia="Times New Roman" w:hAnsi="Calibri" w:cs="Calibri"/>
           <w:color w:val="333333"/>
         </w:rPr>
@@ -8918,7 +8938,7 @@
       </w:pPr>
       <w:r>
         <w:rPr>
-          <w:rStyle w:val="Textoennegrita"/>
+          <w:rStyle w:val="Fuerte"/>
           <w:rFonts w:ascii="Calibri" w:eastAsia="Times New Roman" w:hAnsi="Calibri" w:cs="Calibri"/>
           <w:color w:val="333333"/>
         </w:rPr>
@@ -11056,7 +11076,7 @@
       </w:pPr>
       <w:r>
         <w:rPr>
-          <w:rStyle w:val="Textoennegrita"/>
+          <w:rStyle w:val="Fuerte"/>
           <w:rFonts w:ascii="Calibri" w:eastAsia="Times New Roman" w:hAnsi="Calibri" w:cs="Calibri"/>
           <w:color w:val="333333"/>
         </w:rPr>
@@ -14200,11 +14220,13 @@
         <w:divId w:val="352464823"/>
         <w:rPr>
           <w:color w:val="333333"/>
-        </w:rPr>
-      </w:pPr>
-      <w:r>
-        <w:rPr>
-          <w:color w:val="333333"/>
+          <w:lang w:val="en-US"/>
+        </w:rPr>
+      </w:pPr>
+      <w:r>
+        <w:rPr>
+          <w:color w:val="333333"/>
+          <w:lang w:val="en-US"/>
         </w:rPr>
         <w:t># Permisos</w:t>
       </w:r>
@@ -14215,11 +14237,13 @@
         <w:divId w:val="352464823"/>
         <w:rPr>
           <w:color w:val="333333"/>
-        </w:rPr>
-      </w:pPr>
-      <w:r>
-        <w:rPr>
-          <w:color w:val="333333"/>
+          <w:lang w:val="en-US"/>
+        </w:rPr>
+      </w:pPr>
+      <w:r>
+        <w:rPr>
+          <w:color w:val="333333"/>
+          <w:lang w:val="en-US"/>
         </w:rPr>
         <w:t>chmod 755 uploads/</w:t>
       </w:r>
@@ -14230,11 +14254,13 @@
         <w:divId w:val="352464823"/>
         <w:rPr>
           <w:color w:val="333333"/>
-        </w:rPr>
-      </w:pPr>
-      <w:r>
-        <w:rPr>
-          <w:color w:val="333333"/>
+          <w:lang w:val="en-US"/>
+        </w:rPr>
+      </w:pPr>
+      <w:r>
+        <w:rPr>
+          <w:color w:val="333333"/>
+          <w:lang w:val="en-US"/>
         </w:rPr>
         <w:t>chmod 755 logs/</w:t>
       </w:r>
@@ -14450,11 +14476,13 @@
         <w:divId w:val="352464823"/>
         <w:rPr>
           <w:color w:val="333333"/>
-        </w:rPr>
-      </w:pPr>
-      <w:r>
-        <w:rPr>
-          <w:color w:val="333333"/>
+          <w:lang w:val="en-US"/>
+        </w:rPr>
+      </w:pPr>
+      <w:r>
+        <w:rPr>
+          <w:color w:val="333333"/>
+          <w:lang w:val="en-US"/>
         </w:rPr>
         <w:t># Ejecutar tests</w:t>
       </w:r>
@@ -14531,11 +14559,13 @@
         <w:divId w:val="352464823"/>
         <w:rPr>
           <w:color w:val="333333"/>
-        </w:rPr>
-      </w:pPr>
-      <w:r>
-        <w:rPr>
-          <w:color w:val="333333"/>
+          <w:lang w:val="en-US"/>
+        </w:rPr>
+      </w:pPr>
+      <w:r>
+        <w:rPr>
+          <w:color w:val="333333"/>
+          <w:lang w:val="en-US"/>
         </w:rPr>
         <w:t># Con cobertura (requiere coverage)</w:t>
       </w:r>
@@ -14921,7 +14951,7 @@
       </w:pPr>
       <w:r>
         <w:rPr>
-          <w:rStyle w:val="Textoennegrita"/>
+          <w:rStyle w:val="Fuerte"/>
           <w:rFonts w:ascii="Calibri" w:eastAsia="Times New Roman" w:hAnsi="Calibri" w:cs="Calibri"/>
           <w:color w:val="333333"/>
         </w:rPr>
@@ -15061,7 +15091,7 @@
       </w:pPr>
       <w:r>
         <w:rPr>
-          <w:rStyle w:val="Textoennegrita"/>
+          <w:rStyle w:val="Fuerte"/>
           <w:rFonts w:ascii="Calibri" w:eastAsia="Times New Roman" w:hAnsi="Calibri" w:cs="Calibri"/>
           <w:color w:val="333333"/>
         </w:rPr>
@@ -15201,7 +15231,7 @@
       </w:pPr>
       <w:r>
         <w:rPr>
-          <w:rStyle w:val="Textoennegrita"/>
+          <w:rStyle w:val="Fuerte"/>
           <w:rFonts w:ascii="Calibri" w:eastAsia="Times New Roman" w:hAnsi="Calibri" w:cs="Calibri"/>
           <w:color w:val="333333"/>
         </w:rPr>
@@ -15927,6 +15957,2019 @@
     <w:p>
       <w:pPr>
         <w:pStyle w:val="Ttulo2"/>
+      </w:pPr>
+      <w:r>
+        <w:t>18. MÉTRICAS DE RENDIMIENTO</w:t>
+      </w:r>
+    </w:p>
+    <w:p>
+      <w:pPr>
+        <w:pStyle w:val="Ttulo3"/>
+      </w:pPr>
+      <w:r>
+        <w:t>18.1 Infraestructura de Monitoreo</w:t>
+      </w:r>
+    </w:p>
+    <w:p>
+      <w:r>
+        <w:t>El sistema cuenta con una infraestructura completa de monitoreo basada en Prometheus y Grafana, desplegable mediante el script scripts/setup-monitoring.sh.</w:t>
+      </w:r>
+    </w:p>
+    <w:p>
+      <w:pPr>
+        <w:pStyle w:val="Ttulo3"/>
+      </w:pPr>
+      <w:r>
+        <w:t>Stack de Monitoreo</w:t>
+      </w:r>
+    </w:p>
+    <w:tbl>
+      <w:tblPr>
+        <w:tblW w:w="0" w:type="auto"/>
+        <w:tblLook w:val="04A0" w:firstRow="1" w:lastRow="0" w:firstColumn="1" w:lastColumn="0" w:noHBand="0" w:noVBand="1"/>
+      </w:tblPr>
+      <w:tblGrid>
+        <w:gridCol w:w="2209"/>
+        <w:gridCol w:w="2209"/>
+        <w:gridCol w:w="2209"/>
+        <w:gridCol w:w="2209"/>
+      </w:tblGrid>
+      <w:tr>
+        <w:tc>
+          <w:tcPr>
+            <w:tcW w:w="2209" w:type="dxa"/>
+          </w:tcPr>
+          <w:p>
+            <w:r>
+              <w:t>Componente</w:t>
+            </w:r>
+          </w:p>
+        </w:tc>
+        <w:tc>
+          <w:tcPr>
+            <w:tcW w:w="2209" w:type="dxa"/>
+          </w:tcPr>
+          <w:p>
+            <w:r>
+              <w:t>Versión</w:t>
+            </w:r>
+          </w:p>
+        </w:tc>
+        <w:tc>
+          <w:tcPr>
+            <w:tcW w:w="2209" w:type="dxa"/>
+          </w:tcPr>
+          <w:p>
+            <w:r>
+              <w:t>Puerto</w:t>
+            </w:r>
+          </w:p>
+        </w:tc>
+        <w:tc>
+          <w:tcPr>
+            <w:tcW w:w="2209" w:type="dxa"/>
+          </w:tcPr>
+          <w:p>
+            <w:r>
+              <w:t>Propósito</w:t>
+            </w:r>
+          </w:p>
+        </w:tc>
+      </w:tr>
+      <w:tr>
+        <w:tc>
+          <w:tcPr>
+            <w:tcW w:w="2209" w:type="dxa"/>
+          </w:tcPr>
+          <w:p>
+            <w:r>
+              <w:t>Prometheus</w:t>
+            </w:r>
+          </w:p>
+        </w:tc>
+        <w:tc>
+          <w:tcPr>
+            <w:tcW w:w="2209" w:type="dxa"/>
+          </w:tcPr>
+          <w:p>
+            <w:r>
+              <w:t>2.45.0</w:t>
+            </w:r>
+          </w:p>
+        </w:tc>
+        <w:tc>
+          <w:tcPr>
+            <w:tcW w:w="2209" w:type="dxa"/>
+          </w:tcPr>
+          <w:p>
+            <w:r>
+              <w:t>9090</w:t>
+            </w:r>
+          </w:p>
+        </w:tc>
+        <w:tc>
+          <w:tcPr>
+            <w:tcW w:w="2209" w:type="dxa"/>
+          </w:tcPr>
+          <w:p>
+            <w:r>
+              <w:t>Almacenamiento de métricas y alertas</w:t>
+            </w:r>
+          </w:p>
+        </w:tc>
+      </w:tr>
+      <w:tr>
+        <w:tc>
+          <w:tcPr>
+            <w:tcW w:w="2209" w:type="dxa"/>
+          </w:tcPr>
+          <w:p>
+            <w:r>
+              <w:t>Grafana</w:t>
+            </w:r>
+          </w:p>
+        </w:tc>
+        <w:tc>
+          <w:tcPr>
+            <w:tcW w:w="2209" w:type="dxa"/>
+          </w:tcPr>
+          <w:p>
+            <w:r>
+              <w:t>10.1.0</w:t>
+            </w:r>
+          </w:p>
+        </w:tc>
+        <w:tc>
+          <w:tcPr>
+            <w:tcW w:w="2209" w:type="dxa"/>
+          </w:tcPr>
+          <w:p>
+            <w:r>
+              <w:t>3000</w:t>
+            </w:r>
+          </w:p>
+        </w:tc>
+        <w:tc>
+          <w:tcPr>
+            <w:tcW w:w="2209" w:type="dxa"/>
+          </w:tcPr>
+          <w:p>
+            <w:r>
+              <w:t>Dashboards visuales</w:t>
+            </w:r>
+          </w:p>
+        </w:tc>
+      </w:tr>
+      <w:tr>
+        <w:tc>
+          <w:tcPr>
+            <w:tcW w:w="2209" w:type="dxa"/>
+          </w:tcPr>
+          <w:p>
+            <w:r>
+              <w:t>Node Exporter</w:t>
+            </w:r>
+          </w:p>
+        </w:tc>
+        <w:tc>
+          <w:tcPr>
+            <w:tcW w:w="2209" w:type="dxa"/>
+          </w:tcPr>
+          <w:p>
+            <w:r>
+              <w:t>1.6.1</w:t>
+            </w:r>
+          </w:p>
+        </w:tc>
+        <w:tc>
+          <w:tcPr>
+            <w:tcW w:w="2209" w:type="dxa"/>
+          </w:tcPr>
+          <w:p>
+            <w:r>
+              <w:t>9100</w:t>
+            </w:r>
+          </w:p>
+        </w:tc>
+        <w:tc>
+          <w:tcPr>
+            <w:tcW w:w="2209" w:type="dxa"/>
+          </w:tcPr>
+          <w:p>
+            <w:r>
+              <w:t>Métricas del sistema (CPU, memoria, disco)</w:t>
+            </w:r>
+          </w:p>
+        </w:tc>
+      </w:tr>
+      <w:tr>
+        <w:tc>
+          <w:tcPr>
+            <w:tcW w:w="2209" w:type="dxa"/>
+          </w:tcPr>
+          <w:p>
+            <w:r>
+              <w:t>MySQL Exporter</w:t>
+            </w:r>
+          </w:p>
+        </w:tc>
+        <w:tc>
+          <w:tcPr>
+            <w:tcW w:w="2209" w:type="dxa"/>
+          </w:tcPr>
+          <w:p>
+            <w:r>
+              <w:t>0.15.1</w:t>
+            </w:r>
+          </w:p>
+        </w:tc>
+        <w:tc>
+          <w:tcPr>
+            <w:tcW w:w="2209" w:type="dxa"/>
+          </w:tcPr>
+          <w:p>
+            <w:r>
+              <w:t>9104</w:t>
+            </w:r>
+          </w:p>
+        </w:tc>
+        <w:tc>
+          <w:tcPr>
+            <w:tcW w:w="2209" w:type="dxa"/>
+          </w:tcPr>
+          <w:p>
+            <w:r>
+              <w:t>Métricas de base de datos</w:t>
+            </w:r>
+          </w:p>
+        </w:tc>
+      </w:tr>
+      <w:tr>
+        <w:tc>
+          <w:tcPr>
+            <w:tcW w:w="2209" w:type="dxa"/>
+          </w:tcPr>
+          <w:p>
+            <w:r>
+              <w:lastRenderedPageBreak/>
+              <w:t>Nginx Exporter</w:t>
+            </w:r>
+          </w:p>
+        </w:tc>
+        <w:tc>
+          <w:tcPr>
+            <w:tcW w:w="2209" w:type="dxa"/>
+          </w:tcPr>
+          <w:p>
+            <w:r>
+              <w:t>1.1.0</w:t>
+            </w:r>
+          </w:p>
+        </w:tc>
+        <w:tc>
+          <w:tcPr>
+            <w:tcW w:w="2209" w:type="dxa"/>
+          </w:tcPr>
+          <w:p>
+            <w:r>
+              <w:t>9113</w:t>
+            </w:r>
+          </w:p>
+        </w:tc>
+        <w:tc>
+          <w:tcPr>
+            <w:tcW w:w="2209" w:type="dxa"/>
+          </w:tcPr>
+          <w:p>
+            <w:r>
+              <w:t>Métricas del servidor web</w:t>
+            </w:r>
+          </w:p>
+        </w:tc>
+      </w:tr>
+      <w:tr>
+        <w:tc>
+          <w:tcPr>
+            <w:tcW w:w="2209" w:type="dxa"/>
+          </w:tcPr>
+          <w:p>
+            <w:r>
+              <w:t>PHP-FPM Exporter</w:t>
+            </w:r>
+          </w:p>
+        </w:tc>
+        <w:tc>
+          <w:tcPr>
+            <w:tcW w:w="2209" w:type="dxa"/>
+          </w:tcPr>
+          <w:p>
+            <w:r>
+              <w:t>—</w:t>
+            </w:r>
+          </w:p>
+        </w:tc>
+        <w:tc>
+          <w:tcPr>
+            <w:tcW w:w="2209" w:type="dxa"/>
+          </w:tcPr>
+          <w:p>
+            <w:r>
+              <w:t>9253</w:t>
+            </w:r>
+          </w:p>
+        </w:tc>
+        <w:tc>
+          <w:tcPr>
+            <w:tcW w:w="2209" w:type="dxa"/>
+          </w:tcPr>
+          <w:p>
+            <w:r>
+              <w:t>Métricas de PHP-FPM</w:t>
+            </w:r>
+          </w:p>
+        </w:tc>
+      </w:tr>
+      <w:tr>
+        <w:tc>
+          <w:tcPr>
+            <w:tcW w:w="2209" w:type="dxa"/>
+          </w:tcPr>
+          <w:p>
+            <w:r>
+              <w:t>Redis Exporter</w:t>
+            </w:r>
+          </w:p>
+        </w:tc>
+        <w:tc>
+          <w:tcPr>
+            <w:tcW w:w="2209" w:type="dxa"/>
+          </w:tcPr>
+          <w:p>
+            <w:r>
+              <w:t>1.45.0</w:t>
+            </w:r>
+          </w:p>
+        </w:tc>
+        <w:tc>
+          <w:tcPr>
+            <w:tcW w:w="2209" w:type="dxa"/>
+          </w:tcPr>
+          <w:p>
+            <w:r>
+              <w:t>9121</w:t>
+            </w:r>
+          </w:p>
+        </w:tc>
+        <w:tc>
+          <w:tcPr>
+            <w:tcW w:w="2209" w:type="dxa"/>
+          </w:tcPr>
+          <w:p>
+            <w:r>
+              <w:t>Métricas de caché</w:t>
+            </w:r>
+          </w:p>
+        </w:tc>
+      </w:tr>
+    </w:tbl>
+    <w:p>
+      <w:pPr>
+        <w:pStyle w:val="Ttulo3"/>
+      </w:pPr>
+      <w:r>
+        <w:t>Dashboard Grafana</w:t>
+      </w:r>
+    </w:p>
+    <w:p>
+      <w:r>
+        <w:t>Se provee un dashboard precargado (monitoring/grafana/dashboards/sistema-biometrico-general.json) con 19 paneles: Estado del Sistema, Usuarios Activos, Tasa de Error HTTP, Tiempo de Respuesta p95 (verde &lt;1s, amarillo &lt;2s, rojo &gt;2s), Uso de CPU/Memoria/Disco, Requests por Segundo, Conexiones MySQL, Consultas Lentas, Usuarios Concurrentes, Registros Entrada/Salida, Hit Rate Redis, Uso de Memoria Redis y Alertas Activas. Refresh cada 30s.</w:t>
+      </w:r>
+    </w:p>
+    <w:p>
+      <w:pPr>
+        <w:pStyle w:val="Ttulo3"/>
+      </w:pPr>
+      <w:r>
+        <w:t>18.2 Métricas de Base de Datos</w:t>
+      </w:r>
+    </w:p>
+    <w:p>
+      <w:pPr>
+        <w:pStyle w:val="Ttulo3"/>
+      </w:pPr>
+      <w:r>
+        <w:t>Índices de Rendimiento</w:t>
+      </w:r>
+    </w:p>
+    <w:p>
+      <w:r>
+        <w:t>El sistema implementa 13 índices estratégicos creados mediante scripts/create_indexes.php:</w:t>
+      </w:r>
+    </w:p>
+    <w:tbl>
+      <w:tblPr>
+        <w:tblW w:w="0" w:type="auto"/>
+        <w:tblLook w:val="04A0" w:firstRow="1" w:lastRow="0" w:firstColumn="1" w:lastColumn="0" w:noHBand="0" w:noVBand="1"/>
+      </w:tblPr>
+      <w:tblGrid>
+        <w:gridCol w:w="4082"/>
+        <w:gridCol w:w="2556"/>
+        <w:gridCol w:w="2200"/>
+      </w:tblGrid>
+      <w:tr>
+        <w:tc>
+          <w:tcPr>
+            <w:tcW w:w="2946" w:type="dxa"/>
+          </w:tcPr>
+          <w:p>
+            <w:r>
+              <w:t>Índice</w:t>
+            </w:r>
+          </w:p>
+        </w:tc>
+        <w:tc>
+          <w:tcPr>
+            <w:tcW w:w="2946" w:type="dxa"/>
+          </w:tcPr>
+          <w:p>
+            <w:r>
+              <w:t>Columnas</w:t>
+            </w:r>
+          </w:p>
+        </w:tc>
+        <w:tc>
+          <w:tcPr>
+            <w:tcW w:w="2946" w:type="dxa"/>
+          </w:tcPr>
+          <w:p>
+            <w:r>
+              <w:t>Impacto</w:t>
+            </w:r>
+          </w:p>
+        </w:tc>
+      </w:tr>
+      <w:tr>
+        <w:tc>
+          <w:tcPr>
+            <w:tcW w:w="2946" w:type="dxa"/>
+          </w:tcPr>
+          <w:p>
+            <w:r>
+              <w:t>idx_asistencia_empleado_timestamp</w:t>
+            </w:r>
+          </w:p>
+        </w:tc>
+        <w:tc>
+          <w:tcPr>
+            <w:tcW w:w="2946" w:type="dxa"/>
+          </w:tcPr>
+          <w:p>
+            <w:r>
+              <w:t>empleado_id, timestamp DESC</w:t>
+            </w:r>
+          </w:p>
+        </w:tc>
+        <w:tc>
+          <w:tcPr>
+            <w:tcW w:w="2946" w:type="dxa"/>
+          </w:tcPr>
+          <w:p>
+            <w:r>
+              <w:t>70-80% más rápido</w:t>
+            </w:r>
+          </w:p>
+        </w:tc>
+      </w:tr>
+      <w:tr>
+        <w:tc>
+          <w:tcPr>
+            <w:tcW w:w="2946" w:type="dxa"/>
+          </w:tcPr>
+          <w:p>
+            <w:r>
+              <w:t>idx_asistencia_dispositivo_timestamp</w:t>
+            </w:r>
+          </w:p>
+        </w:tc>
+        <w:tc>
+          <w:tcPr>
+            <w:tcW w:w="2946" w:type="dxa"/>
+          </w:tcPr>
+          <w:p>
+            <w:r>
+              <w:t>dispositivo_id, timestamp DESC</w:t>
+            </w:r>
+          </w:p>
+        </w:tc>
+        <w:tc>
+          <w:tcPr>
+            <w:tcW w:w="2946" w:type="dxa"/>
+          </w:tcPr>
+          <w:p>
+            <w:r>
+              <w:t>Consultas por disp.</w:t>
+            </w:r>
+          </w:p>
+        </w:tc>
+      </w:tr>
+      <w:tr>
+        <w:tc>
+          <w:tcPr>
+            <w:tcW w:w="2946" w:type="dxa"/>
+          </w:tcPr>
+          <w:p>
+            <w:r>
+              <w:t>idx_empleados_area_activo</w:t>
+            </w:r>
+          </w:p>
+        </w:tc>
+        <w:tc>
+          <w:tcPr>
+            <w:tcW w:w="2946" w:type="dxa"/>
+          </w:tcPr>
+          <w:p>
+            <w:r>
+              <w:t>area, activo</w:t>
+            </w:r>
+          </w:p>
+        </w:tc>
+        <w:tc>
+          <w:tcPr>
+            <w:tcW w:w="2946" w:type="dxa"/>
+          </w:tcPr>
+          <w:p>
+            <w:r>
+              <w:t>60-70% más rápido</w:t>
+            </w:r>
+          </w:p>
+        </w:tc>
+      </w:tr>
+      <w:tr>
+        <w:tc>
+          <w:tcPr>
+            <w:tcW w:w="2946" w:type="dxa"/>
+          </w:tcPr>
+          <w:p>
+            <w:r>
+              <w:t>idx_retardos_empleado_fecha</w:t>
+            </w:r>
+          </w:p>
+        </w:tc>
+        <w:tc>
+          <w:tcPr>
+            <w:tcW w:w="2946" w:type="dxa"/>
+          </w:tcPr>
+          <w:p>
+            <w:r>
+              <w:t>empleado_id, fecha DESC</w:t>
+            </w:r>
+          </w:p>
+        </w:tc>
+        <w:tc>
+          <w:tcPr>
+            <w:tcW w:w="2946" w:type="dxa"/>
+          </w:tcPr>
+          <w:p>
+            <w:r>
+              <w:t>65-75% más rápido</w:t>
+            </w:r>
+          </w:p>
+        </w:tc>
+      </w:tr>
+      <w:tr>
+        <w:tc>
+          <w:tcPr>
+            <w:tcW w:w="2946" w:type="dxa"/>
+          </w:tcPr>
+          <w:p>
+            <w:r>
+              <w:t>idx_comisiones_empleado_vencimiento</w:t>
+            </w:r>
+          </w:p>
+        </w:tc>
+        <w:tc>
+          <w:tcPr>
+            <w:tcW w:w="2946" w:type="dxa"/>
+          </w:tcPr>
+          <w:p>
+            <w:r>
+              <w:t>empleado_id, fecha_vencimiento DESC</w:t>
+            </w:r>
+          </w:p>
+        </w:tc>
+        <w:tc>
+          <w:tcPr>
+            <w:tcW w:w="2946" w:type="dxa"/>
+          </w:tcPr>
+          <w:p>
+            <w:r>
+              <w:t>60-70% más rápido</w:t>
+            </w:r>
+          </w:p>
+        </w:tc>
+      </w:tr>
+      <w:tr>
+        <w:tc>
+          <w:tcPr>
+            <w:tcW w:w="2946" w:type="dxa"/>
+          </w:tcPr>
+          <w:p>
+            <w:r>
+              <w:t>idx_asistencia_empleado_ano_mes</w:t>
+            </w:r>
+          </w:p>
+        </w:tc>
+        <w:tc>
+          <w:tcPr>
+            <w:tcW w:w="2946" w:type="dxa"/>
+          </w:tcPr>
+          <w:p>
+            <w:r>
+              <w:t>empleado_id, YEAR, MONTH</w:t>
+            </w:r>
+          </w:p>
+        </w:tc>
+        <w:tc>
+          <w:tcPr>
+            <w:tcW w:w="2946" w:type="dxa"/>
+          </w:tcPr>
+          <w:p>
+            <w:r>
+              <w:t>Reportes mensuales</w:t>
+            </w:r>
+          </w:p>
+        </w:tc>
+      </w:tr>
+    </w:tbl>
+    <w:p>
+      <w:pPr>
+        <w:pStyle w:val="Ttulo3"/>
+      </w:pPr>
+      <w:r>
+        <w:t>Optimización MySQL</w:t>
+      </w:r>
+    </w:p>
+    <w:tbl>
+      <w:tblPr>
+        <w:tblW w:w="0" w:type="auto"/>
+        <w:tblLook w:val="04A0" w:firstRow="1" w:lastRow="0" w:firstColumn="1" w:lastColumn="0" w:noHBand="0" w:noVBand="1"/>
+      </w:tblPr>
+      <w:tblGrid>
+        <w:gridCol w:w="3443"/>
+        <w:gridCol w:w="2657"/>
+        <w:gridCol w:w="2738"/>
+      </w:tblGrid>
+      <w:tr>
+        <w:tc>
+          <w:tcPr>
+            <w:tcW w:w="2946" w:type="dxa"/>
+          </w:tcPr>
+          <w:p>
+            <w:r>
+              <w:t>Parámetro</w:t>
+            </w:r>
+          </w:p>
+        </w:tc>
+        <w:tc>
+          <w:tcPr>
+            <w:tcW w:w="2946" w:type="dxa"/>
+          </w:tcPr>
+          <w:p>
+            <w:r>
+              <w:t>Valor</w:t>
+            </w:r>
+          </w:p>
+        </w:tc>
+        <w:tc>
+          <w:tcPr>
+            <w:tcW w:w="2946" w:type="dxa"/>
+          </w:tcPr>
+          <w:p>
+            <w:r>
+              <w:t>Efecto</w:t>
+            </w:r>
+          </w:p>
+        </w:tc>
+      </w:tr>
+      <w:tr>
+        <w:tc>
+          <w:tcPr>
+            <w:tcW w:w="2946" w:type="dxa"/>
+          </w:tcPr>
+          <w:p>
+            <w:r>
+              <w:t>query_cache_size</w:t>
+            </w:r>
+          </w:p>
+        </w:tc>
+        <w:tc>
+          <w:tcPr>
+            <w:tcW w:w="2946" w:type="dxa"/>
+          </w:tcPr>
+          <w:p>
+            <w:r>
+              <w:t>256MB</w:t>
+            </w:r>
+          </w:p>
+        </w:tc>
+        <w:tc>
+          <w:tcPr>
+            <w:tcW w:w="2946" w:type="dxa"/>
+          </w:tcPr>
+          <w:p>
+            <w:r>
+              <w:t>Caché de consultas repetidas</w:t>
+            </w:r>
+          </w:p>
+        </w:tc>
+      </w:tr>
+      <w:tr>
+        <w:tc>
+          <w:tcPr>
+            <w:tcW w:w="2946" w:type="dxa"/>
+          </w:tcPr>
+          <w:p>
+            <w:r>
+              <w:t>innodb_buffer_pool_size</w:t>
+            </w:r>
+          </w:p>
+        </w:tc>
+        <w:tc>
+          <w:tcPr>
+            <w:tcW w:w="2946" w:type="dxa"/>
+          </w:tcPr>
+          <w:p>
+            <w:r>
+              <w:t>1GB</w:t>
+            </w:r>
+          </w:p>
+        </w:tc>
+        <w:tc>
+          <w:tcPr>
+            <w:tcW w:w="2946" w:type="dxa"/>
+          </w:tcPr>
+          <w:p>
+            <w:r>
+              <w:t>Caché de datos en memoria</w:t>
+            </w:r>
+          </w:p>
+        </w:tc>
+      </w:tr>
+      <w:tr>
+        <w:tc>
+          <w:tcPr>
+            <w:tcW w:w="2946" w:type="dxa"/>
+          </w:tcPr>
+          <w:p>
+            <w:r>
+              <w:t>innodb_log_file_size</w:t>
+            </w:r>
+          </w:p>
+        </w:tc>
+        <w:tc>
+          <w:tcPr>
+            <w:tcW w:w="2946" w:type="dxa"/>
+          </w:tcPr>
+          <w:p>
+            <w:r>
+              <w:t>256MB</w:t>
+            </w:r>
+          </w:p>
+        </w:tc>
+        <w:tc>
+          <w:tcPr>
+            <w:tcW w:w="2946" w:type="dxa"/>
+          </w:tcPr>
+          <w:p>
+            <w:r>
+              <w:t>Reducción de I/O en transacciones</w:t>
+            </w:r>
+          </w:p>
+        </w:tc>
+      </w:tr>
+      <w:tr>
+        <w:tc>
+          <w:tcPr>
+            <w:tcW w:w="2946" w:type="dxa"/>
+          </w:tcPr>
+          <w:p>
+            <w:pPr>
+              <w:rPr>
+                <w:lang w:val="en-US"/>
+              </w:rPr>
+            </w:pPr>
+            <w:r>
+              <w:rPr>
+                <w:lang w:val="en-US"/>
+              </w:rPr>
+              <w:t>innodb_flush_log_at_trx_commit</w:t>
+            </w:r>
+          </w:p>
+        </w:tc>
+        <w:tc>
+          <w:tcPr>
+            <w:tcW w:w="2946" w:type="dxa"/>
+          </w:tcPr>
+          <w:p>
+            <w:r>
+              <w:t>2</w:t>
+            </w:r>
+          </w:p>
+        </w:tc>
+        <w:tc>
+          <w:tcPr>
+            <w:tcW w:w="2946" w:type="dxa"/>
+          </w:tcPr>
+          <w:p>
+            <w:r>
+              <w:t>Balance rendimiento-durabilidad</w:t>
+            </w:r>
+          </w:p>
+        </w:tc>
+      </w:tr>
+    </w:tbl>
+    <w:p>
+      <w:pPr>
+        <w:pStyle w:val="Ttulo3"/>
+      </w:pPr>
+      <w:r>
+        <w:lastRenderedPageBreak/>
+        <w:t>18.3 Métricas de la Aplicación</w:t>
+      </w:r>
+    </w:p>
+    <w:p>
+      <w:r>
+        <w:t>El sistema rastrea tiempos de ejecución mediante microtime(true) en 82 ubicaciones del código y memory_get_usage(true) en 7 ubicaciones.</w:t>
+      </w:r>
+    </w:p>
+    <w:tbl>
+      <w:tblPr>
+        <w:tblW w:w="0" w:type="auto"/>
+        <w:tblLook w:val="04A0" w:firstRow="1" w:lastRow="0" w:firstColumn="1" w:lastColumn="0" w:noHBand="0" w:noVBand="1"/>
+      </w:tblPr>
+      <w:tblGrid>
+        <w:gridCol w:w="2946"/>
+        <w:gridCol w:w="2946"/>
+        <w:gridCol w:w="2946"/>
+      </w:tblGrid>
+      <w:tr>
+        <w:tc>
+          <w:tcPr>
+            <w:tcW w:w="2946" w:type="dxa"/>
+          </w:tcPr>
+          <w:p>
+            <w:r>
+              <w:t>Componente</w:t>
+            </w:r>
+          </w:p>
+        </w:tc>
+        <w:tc>
+          <w:tcPr>
+            <w:tcW w:w="2946" w:type="dxa"/>
+          </w:tcPr>
+          <w:p>
+            <w:r>
+              <w:t>Operación</w:t>
+            </w:r>
+          </w:p>
+        </w:tc>
+        <w:tc>
+          <w:tcPr>
+            <w:tcW w:w="2946" w:type="dxa"/>
+          </w:tcPr>
+          <w:p>
+            <w:r>
+              <w:t>Tiempo Típico</w:t>
+            </w:r>
+          </w:p>
+        </w:tc>
+      </w:tr>
+      <w:tr>
+        <w:tc>
+          <w:tcPr>
+            <w:tcW w:w="2946" w:type="dxa"/>
+          </w:tcPr>
+          <w:p>
+            <w:r>
+              <w:t>AsistenciaController</w:t>
+            </w:r>
+          </w:p>
+        </w:tc>
+        <w:tc>
+          <w:tcPr>
+            <w:tcW w:w="2946" w:type="dxa"/>
+          </w:tcPr>
+          <w:p>
+            <w:r>
+              <w:t>Procesamiento de asistencia</w:t>
+            </w:r>
+          </w:p>
+        </w:tc>
+        <w:tc>
+          <w:tcPr>
+            <w:tcW w:w="2946" w:type="dxa"/>
+          </w:tcPr>
+          <w:p>
+            <w:r>
+              <w:t>&lt;500ms</w:t>
+            </w:r>
+          </w:p>
+        </w:tc>
+      </w:tr>
+      <w:tr>
+        <w:tc>
+          <w:tcPr>
+            <w:tcW w:w="2946" w:type="dxa"/>
+          </w:tcPr>
+          <w:p>
+            <w:r>
+              <w:t>ConfiguracionController</w:t>
+            </w:r>
+          </w:p>
+        </w:tc>
+        <w:tc>
+          <w:tcPr>
+            <w:tcW w:w="2946" w:type="dxa"/>
+          </w:tcPr>
+          <w:p>
+            <w:r>
+              <w:t>Carga ZKTeco batch</w:t>
+            </w:r>
+          </w:p>
+        </w:tc>
+        <w:tc>
+          <w:tcPr>
+            <w:tcW w:w="2946" w:type="dxa"/>
+          </w:tcPr>
+          <w:p>
+            <w:r>
+              <w:t>&lt;30s</w:t>
+            </w:r>
+          </w:p>
+        </w:tc>
+      </w:tr>
+      <w:tr>
+        <w:tc>
+          <w:tcPr>
+            <w:tcW w:w="2946" w:type="dxa"/>
+          </w:tcPr>
+          <w:p>
+            <w:r>
+              <w:t>ZKTecoAsistenciaInserter</w:t>
+            </w:r>
+          </w:p>
+        </w:tc>
+        <w:tc>
+          <w:tcPr>
+            <w:tcW w:w="2946" w:type="dxa"/>
+          </w:tcPr>
+          <w:p>
+            <w:r>
+              <w:t>Inserción batch 1000 reg.</w:t>
+            </w:r>
+          </w:p>
+        </w:tc>
+        <w:tc>
+          <w:tcPr>
+            <w:tcW w:w="2946" w:type="dxa"/>
+          </w:tcPr>
+          <w:p>
+            <w:r>
+              <w:t>&lt;60s</w:t>
+            </w:r>
+          </w:p>
+        </w:tc>
+      </w:tr>
+      <w:tr>
+        <w:tc>
+          <w:tcPr>
+            <w:tcW w:w="2946" w:type="dxa"/>
+          </w:tcPr>
+          <w:p>
+            <w:r>
+              <w:t>PerformanceOptimizer</w:t>
+            </w:r>
+          </w:p>
+        </w:tc>
+        <w:tc>
+          <w:tcPr>
+            <w:tcW w:w="2946" w:type="dxa"/>
+          </w:tcPr>
+          <w:p>
+            <w:r>
+              <w:t>Request completo p95</w:t>
+            </w:r>
+          </w:p>
+        </w:tc>
+        <w:tc>
+          <w:tcPr>
+            <w:tcW w:w="2946" w:type="dxa"/>
+          </w:tcPr>
+          <w:p>
+            <w:r>
+              <w:t>&lt;2s</w:t>
+            </w:r>
+          </w:p>
+        </w:tc>
+      </w:tr>
+      <w:tr>
+        <w:tc>
+          <w:tcPr>
+            <w:tcW w:w="2946" w:type="dxa"/>
+          </w:tcPr>
+          <w:p>
+            <w:r>
+              <w:t>Reportes Excel</w:t>
+            </w:r>
+          </w:p>
+        </w:tc>
+        <w:tc>
+          <w:tcPr>
+            <w:tcW w:w="2946" w:type="dxa"/>
+          </w:tcPr>
+          <w:p>
+            <w:r>
+              <w:t>Generación de reportes</w:t>
+            </w:r>
+          </w:p>
+        </w:tc>
+        <w:tc>
+          <w:tcPr>
+            <w:tcW w:w="2946" w:type="dxa"/>
+          </w:tcPr>
+          <w:p>
+            <w:r>
+              <w:t>&lt;30s</w:t>
+            </w:r>
+          </w:p>
+        </w:tc>
+      </w:tr>
+    </w:tbl>
+    <w:p>
+      <w:r>
+        <w:rPr>
+          <w:lang w:val="en-US"/>
+        </w:rPr>
+        <w:t xml:space="preserve">Límites: max_execution_time 300s, memory_limit 256M (512M biométrico), upload_max_filesize 20M. </w:t>
+      </w:r>
+      <w:r>
+        <w:t>Logging JSON estructurado con rotación 10MB/5 archivos.</w:t>
+      </w:r>
+    </w:p>
+    <w:p>
+      <w:pPr>
+        <w:pStyle w:val="Ttulo3"/>
+      </w:pPr>
+      <w:r>
+        <w:t>18.4 Métricas de Caché</w:t>
+      </w:r>
+    </w:p>
+    <w:p>
+      <w:r>
+        <w:t>Sistema centralizado en helpers/CacheManager.php con Redis (primario) + file (fallback). TTL default 3600s. Hit Rate objetivo &gt;80%.</w:t>
+      </w:r>
+    </w:p>
+    <w:tbl>
+      <w:tblPr>
+        <w:tblW w:w="0" w:type="auto"/>
+        <w:tblLook w:val="04A0" w:firstRow="1" w:lastRow="0" w:firstColumn="1" w:lastColumn="0" w:noHBand="0" w:noVBand="1"/>
+      </w:tblPr>
+      <w:tblGrid>
+        <w:gridCol w:w="2946"/>
+        <w:gridCol w:w="2946"/>
+        <w:gridCol w:w="2946"/>
+      </w:tblGrid>
+      <w:tr>
+        <w:tc>
+          <w:tcPr>
+            <w:tcW w:w="2946" w:type="dxa"/>
+          </w:tcPr>
+          <w:p>
+            <w:r>
+              <w:t>Tipo de Caché</w:t>
+            </w:r>
+          </w:p>
+        </w:tc>
+        <w:tc>
+          <w:tcPr>
+            <w:tcW w:w="2946" w:type="dxa"/>
+          </w:tcPr>
+          <w:p>
+            <w:r>
+              <w:t>TTL</w:t>
+            </w:r>
+          </w:p>
+        </w:tc>
+        <w:tc>
+          <w:tcPr>
+            <w:tcW w:w="2946" w:type="dxa"/>
+          </w:tcPr>
+          <w:p>
+            <w:r>
+              <w:t>Impacto</w:t>
+            </w:r>
+          </w:p>
+        </w:tc>
+      </w:tr>
+      <w:tr>
+        <w:tc>
+          <w:tcPr>
+            <w:tcW w:w="2946" w:type="dxa"/>
+          </w:tcPr>
+          <w:p>
+            <w:r>
+              <w:t>Consultas SQL (MD5 query+params)</w:t>
+            </w:r>
+          </w:p>
+        </w:tc>
+        <w:tc>
+          <w:tcPr>
+            <w:tcW w:w="2946" w:type="dxa"/>
+          </w:tcPr>
+          <w:p>
+            <w:r>
+              <w:t>10-30 min</w:t>
+            </w:r>
+          </w:p>
+        </w:tc>
+        <w:tc>
+          <w:tcPr>
+            <w:tcW w:w="2946" w:type="dxa"/>
+          </w:tcPr>
+          <w:p>
+            <w:r>
+              <w:t>Reduce carga BD 70%</w:t>
+            </w:r>
+          </w:p>
+        </w:tc>
+      </w:tr>
+      <w:tr>
+        <w:tc>
+          <w:tcPr>
+            <w:tcW w:w="2946" w:type="dxa"/>
+          </w:tcPr>
+          <w:p>
+            <w:r>
+              <w:t>Datos paginados de empleados</w:t>
+            </w:r>
+          </w:p>
+        </w:tc>
+        <w:tc>
+          <w:tcPr>
+            <w:tcW w:w="2946" w:type="dxa"/>
+          </w:tcPr>
+          <w:p>
+            <w:r>
+              <w:t>10 min</w:t>
+            </w:r>
+          </w:p>
+        </w:tc>
+        <w:tc>
+          <w:tcPr>
+            <w:tcW w:w="2946" w:type="dxa"/>
+          </w:tcPr>
+          <w:p>
+            <w:r>
+              <w:t>Carga instantánea</w:t>
+            </w:r>
+          </w:p>
+        </w:tc>
+      </w:tr>
+      <w:tr>
+        <w:tc>
+          <w:tcPr>
+            <w:tcW w:w="2946" w:type="dxa"/>
+          </w:tcPr>
+          <w:p>
+            <w:r>
+              <w:t>Asistencia optimizada</w:t>
+            </w:r>
+          </w:p>
+        </w:tc>
+        <w:tc>
+          <w:tcPr>
+            <w:tcW w:w="2946" w:type="dxa"/>
+          </w:tcPr>
+          <w:p>
+            <w:r>
+              <w:t>30 min</w:t>
+            </w:r>
+          </w:p>
+        </w:tc>
+        <w:tc>
+          <w:tcPr>
+            <w:tcW w:w="2946" w:type="dxa"/>
+          </w:tcPr>
+          <w:p>
+            <w:r>
+              <w:t>Reportes rápidos</w:t>
+            </w:r>
+          </w:p>
+        </w:tc>
+      </w:tr>
+      <w:tr>
+        <w:tc>
+          <w:tcPr>
+            <w:tcW w:w="2946" w:type="dxa"/>
+          </w:tcPr>
+          <w:p>
+            <w:r>
+              <w:t>Templates biométricos</w:t>
+            </w:r>
+          </w:p>
+        </w:tc>
+        <w:tc>
+          <w:tcPr>
+            <w:tcW w:w="2946" w:type="dxa"/>
+          </w:tcPr>
+          <w:p>
+            <w:r>
+              <w:t>3600s</w:t>
+            </w:r>
+          </w:p>
+        </w:tc>
+        <w:tc>
+          <w:tcPr>
+            <w:tcW w:w="2946" w:type="dxa"/>
+          </w:tcPr>
+          <w:p>
+            <w:r>
+              <w:t>Sincronización eficiente</w:t>
+            </w:r>
+          </w:p>
+        </w:tc>
+      </w:tr>
+      <w:tr>
+        <w:tc>
+          <w:tcPr>
+            <w:tcW w:w="2946" w:type="dxa"/>
+          </w:tcPr>
+          <w:p>
+            <w:r>
+              <w:t>Archivos estáticos (navegador)</w:t>
+            </w:r>
+          </w:p>
+        </w:tc>
+        <w:tc>
+          <w:tcPr>
+            <w:tcW w:w="2946" w:type="dxa"/>
+          </w:tcPr>
+          <w:p>
+            <w:r>
+              <w:t>1 año</w:t>
+            </w:r>
+          </w:p>
+        </w:tc>
+        <w:tc>
+          <w:tcPr>
+            <w:tcW w:w="2946" w:type="dxa"/>
+          </w:tcPr>
+          <w:p>
+            <w:r>
+              <w:t>Sin recarga de assets</w:t>
+            </w:r>
+          </w:p>
+        </w:tc>
+      </w:tr>
+    </w:tbl>
+    <w:p>
+      <w:pPr>
+        <w:pStyle w:val="Ttulo3"/>
+      </w:pPr>
+      <w:r>
+        <w:t>18.5 Métricas de Dispositivos Biométricos</w:t>
+      </w:r>
+    </w:p>
+    <w:p>
+      <w:r>
+        <w:t>Rendimiento: 1,000 registros/minuto batch, timeout 300s. Conexión a dispositivo &lt;5s. Verificación biométrica &lt;2s/evento. La tabla logs_dispositivos almacena tiempo_respuesta (ms) por operación.</w:t>
+      </w:r>
+    </w:p>
+    <w:p>
+      <w:pPr>
+        <w:pStyle w:val="Ttulo3"/>
+      </w:pPr>
+      <w:r>
+        <w:t>18.6 Métricas de Negocio (KPIs)</w:t>
+      </w:r>
+    </w:p>
+    <w:p>
+      <w:r>
+        <w:t>El dashboard /dashboard expone KPIs vía /dashboard/real-time-stats: empleados activos, asistencia del día, retardos/ausencias del mes, comisiones, días económicos, licencias, vacaciones, top 5 incidencias y alertas activas. Gráficos de distribución por área/género/turno/antigüedad y tendencia histórica 12 meses.</w:t>
+      </w:r>
+    </w:p>
+    <w:p>
+      <w:pPr>
+        <w:pStyle w:val="Ttulo3"/>
+      </w:pPr>
+      <w:r>
+        <w:t>Métricas Predictivas (IA)</w:t>
+      </w:r>
+    </w:p>
+    <w:p>
+      <w:r>
+        <w:t>Riesgo = min(100, (retardos30d × 5 + min/10 + justif. × 3 + faltas × 20) × 0.7 + (retardos90d × 2 + faltas90d × 10) × 0.3). Niveles: Bajo (0-25), Medio (26-50), Alto (51-75), Crítico (76-100). Alertas: 3+ retardos/7d = Medio, 5+ = Alto, 2+ faltas/7d = Crítico.</w:t>
+      </w:r>
+    </w:p>
+    <w:p>
+      <w:pPr>
+        <w:pStyle w:val="Ttulo3"/>
+      </w:pPr>
+      <w:r>
+        <w:lastRenderedPageBreak/>
+        <w:t>18.7 Alertas Configuradas</w:t>
+      </w:r>
+    </w:p>
+    <w:p>
+      <w:r>
+        <w:t>28 reglas de alerta Prometheus en 8 categorías:</w:t>
+      </w:r>
+    </w:p>
+    <w:tbl>
+      <w:tblPr>
+        <w:tblW w:w="0" w:type="auto"/>
+        <w:tblLook w:val="04A0" w:firstRow="1" w:lastRow="0" w:firstColumn="1" w:lastColumn="0" w:noHBand="0" w:noVBand="1"/>
+      </w:tblPr>
+      <w:tblGrid>
+        <w:gridCol w:w="2946"/>
+        <w:gridCol w:w="2946"/>
+        <w:gridCol w:w="2946"/>
+      </w:tblGrid>
+      <w:tr>
+        <w:tc>
+          <w:tcPr>
+            <w:tcW w:w="2946" w:type="dxa"/>
+          </w:tcPr>
+          <w:p>
+            <w:r>
+              <w:t>Categoría</w:t>
+            </w:r>
+          </w:p>
+        </w:tc>
+        <w:tc>
+          <w:tcPr>
+            <w:tcW w:w="2946" w:type="dxa"/>
+          </w:tcPr>
+          <w:p>
+            <w:r>
+              <w:t>Reglas</w:t>
+            </w:r>
+          </w:p>
+        </w:tc>
+        <w:tc>
+          <w:tcPr>
+            <w:tcW w:w="2946" w:type="dxa"/>
+          </w:tcPr>
+          <w:p>
+            <w:r>
+              <w:t>Umbral</w:t>
+            </w:r>
+          </w:p>
+        </w:tc>
+      </w:tr>
+      <w:tr>
+        <w:tc>
+          <w:tcPr>
+            <w:tcW w:w="2946" w:type="dxa"/>
+          </w:tcPr>
+          <w:p>
+            <w:r>
+              <w:t>System Health</w:t>
+            </w:r>
+          </w:p>
+        </w:tc>
+        <w:tc>
+          <w:tcPr>
+            <w:tcW w:w="2946" w:type="dxa"/>
+          </w:tcPr>
+          <w:p>
+            <w:r>
+              <w:t>InstanceDown, HighMem/CPU, DiskLow</w:t>
+            </w:r>
+          </w:p>
+        </w:tc>
+        <w:tc>
+          <w:tcPr>
+            <w:tcW w:w="2946" w:type="dxa"/>
+          </w:tcPr>
+          <w:p>
+            <w:r>
+              <w:t>Mem &gt;90%, CPU &gt;80%</w:t>
+            </w:r>
+          </w:p>
+        </w:tc>
+      </w:tr>
+      <w:tr>
+        <w:tc>
+          <w:tcPr>
+            <w:tcW w:w="2946" w:type="dxa"/>
+          </w:tcPr>
+          <w:p>
+            <w:r>
+              <w:t>Database</w:t>
+            </w:r>
+          </w:p>
+        </w:tc>
+        <w:tc>
+          <w:tcPr>
+            <w:tcW w:w="2946" w:type="dxa"/>
+          </w:tcPr>
+          <w:p>
+            <w:r>
+              <w:t>MySQLDown, SlowQueries, ConnHigh</w:t>
+            </w:r>
+          </w:p>
+        </w:tc>
+        <w:tc>
+          <w:tcPr>
+            <w:tcW w:w="2946" w:type="dxa"/>
+          </w:tcPr>
+          <w:p>
+            <w:r>
+              <w:t>Slow &gt;0.1/s, Conn &gt;80%</w:t>
+            </w:r>
+          </w:p>
+        </w:tc>
+      </w:tr>
+      <w:tr>
+        <w:tc>
+          <w:tcPr>
+            <w:tcW w:w="2946" w:type="dxa"/>
+          </w:tcPr>
+          <w:p>
+            <w:r>
+              <w:t>Web Server</w:t>
+            </w:r>
+          </w:p>
+        </w:tc>
+        <w:tc>
+          <w:tcPr>
+            <w:tcW w:w="2946" w:type="dxa"/>
+          </w:tcPr>
+          <w:p>
+            <w:r>
+              <w:t>NginxDown, HighRespTime, HighError</w:t>
+            </w:r>
+          </w:p>
+        </w:tc>
+        <w:tc>
+          <w:tcPr>
+            <w:tcW w:w="2946" w:type="dxa"/>
+          </w:tcPr>
+          <w:p>
+            <w:r>
+              <w:t>p95 &gt;2s, Error &gt;5%</w:t>
+            </w:r>
+          </w:p>
+        </w:tc>
+      </w:tr>
+      <w:tr>
+        <w:tc>
+          <w:tcPr>
+            <w:tcW w:w="2946" w:type="dxa"/>
+          </w:tcPr>
+          <w:p>
+            <w:r>
+              <w:t>PHP-FPM</w:t>
+            </w:r>
+          </w:p>
+        </w:tc>
+        <w:tc>
+          <w:tcPr>
+            <w:tcW w:w="2946" w:type="dxa"/>
+          </w:tcPr>
+          <w:p>
+            <w:r>
+              <w:t>Down, HighProcessCount, HighMem</w:t>
+            </w:r>
+          </w:p>
+        </w:tc>
+        <w:tc>
+          <w:tcPr>
+            <w:tcW w:w="2946" w:type="dxa"/>
+          </w:tcPr>
+          <w:p>
+            <w:r>
+              <w:t>Proc/Mem &gt;80%</w:t>
+            </w:r>
+          </w:p>
+        </w:tc>
+      </w:tr>
+      <w:tr>
+        <w:tc>
+          <w:tcPr>
+            <w:tcW w:w="2946" w:type="dxa"/>
+          </w:tcPr>
+          <w:p>
+            <w:r>
+              <w:t>Redis Cache</w:t>
+            </w:r>
+          </w:p>
+        </w:tc>
+        <w:tc>
+          <w:tcPr>
+            <w:tcW w:w="2946" w:type="dxa"/>
+          </w:tcPr>
+          <w:p>
+            <w:r>
+              <w:t>Down, HighMem, LowHitRate</w:t>
+            </w:r>
+          </w:p>
+        </w:tc>
+        <w:tc>
+          <w:tcPr>
+            <w:tcW w:w="2946" w:type="dxa"/>
+          </w:tcPr>
+          <w:p>
+            <w:r>
+              <w:t>Mem &gt;90%, Hit &lt;80%</w:t>
+            </w:r>
+          </w:p>
+        </w:tc>
+      </w:tr>
+      <w:tr>
+        <w:tc>
+          <w:tcPr>
+            <w:tcW w:w="2946" w:type="dxa"/>
+          </w:tcPr>
+          <w:p>
+            <w:r>
+              <w:t>Application</w:t>
+            </w:r>
+          </w:p>
+        </w:tc>
+        <w:tc>
+          <w:tcPr>
+            <w:tcW w:w="2946" w:type="dxa"/>
+          </w:tcPr>
+          <w:p>
+            <w:r>
+              <w:t>HighRespTime, HighError, LowUsers</w:t>
+            </w:r>
+          </w:p>
+        </w:tc>
+        <w:tc>
+          <w:tcPr>
+            <w:tcW w:w="2946" w:type="dxa"/>
+          </w:tcPr>
+          <w:p>
+            <w:r>
+              <w:t>p95 &gt;3s, Error &gt;5%</w:t>
+            </w:r>
+          </w:p>
+        </w:tc>
+      </w:tr>
+      <w:tr>
+        <w:tc>
+          <w:tcPr>
+            <w:tcW w:w="2946" w:type="dxa"/>
+          </w:tcPr>
+          <w:p>
+            <w:r>
+              <w:t>Business</w:t>
+            </w:r>
+          </w:p>
+        </w:tc>
+        <w:tc>
+          <w:tcPr>
+            <w:tcW w:w="2946" w:type="dxa"/>
+          </w:tcPr>
+          <w:p>
+            <w:r>
+              <w:t>NoCheckins, Anomalous, FailedLogins</w:t>
+            </w:r>
+          </w:p>
+        </w:tc>
+        <w:tc>
+          <w:tcPr>
+            <w:tcW w:w="2946" w:type="dxa"/>
+          </w:tcPr>
+          <w:p>
+            <w:r>
+              <w:t>Cambio &gt;50%</w:t>
+            </w:r>
+          </w:p>
+        </w:tc>
+      </w:tr>
+      <w:tr>
+        <w:tc>
+          <w:tcPr>
+            <w:tcW w:w="2946" w:type="dxa"/>
+          </w:tcPr>
+          <w:p>
+            <w:r>
+              <w:t>Security</w:t>
+            </w:r>
+          </w:p>
+        </w:tc>
+        <w:tc>
+          <w:tcPr>
+            <w:tcW w:w="2946" w:type="dxa"/>
+          </w:tcPr>
+          <w:p>
+            <w:r>
+              <w:t>SuspiciousActivity, UnusualAccess</w:t>
+            </w:r>
+          </w:p>
+        </w:tc>
+        <w:tc>
+          <w:tcPr>
+            <w:tcW w:w="2946" w:type="dxa"/>
+          </w:tcPr>
+          <w:p>
+            <w:r>
+              <w:t>Cambio &gt;200%</w:t>
+            </w:r>
+          </w:p>
+        </w:tc>
+      </w:tr>
+    </w:tbl>
+    <w:p>
+      <w:pPr>
+        <w:pStyle w:val="Ttulo3"/>
+      </w:pPr>
+      <w:r>
+        <w:t>18.8 Pruebas de Rendimiento</w:t>
+      </w:r>
+    </w:p>
+    <w:p>
+      <w:r>
+        <w:t>Load Testing con Apache Bench (scripts/performance-test.sh): page load (1K-2K req, 10-20 concurrentes), API perf, carga progresiva (1-100 concurrentes), stress 120s ~100 RPS, endurance.</w:t>
+      </w:r>
+    </w:p>
+    <w:tbl>
+      <w:tblPr>
+        <w:tblW w:w="0" w:type="auto"/>
+        <w:tblLook w:val="04A0" w:firstRow="1" w:lastRow="0" w:firstColumn="1" w:lastColumn="0" w:noHBand="0" w:noVBand="1"/>
+      </w:tblPr>
+      <w:tblGrid>
+        <w:gridCol w:w="2209"/>
+        <w:gridCol w:w="2209"/>
+        <w:gridCol w:w="2209"/>
+        <w:gridCol w:w="2209"/>
+      </w:tblGrid>
+      <w:tr>
+        <w:tc>
+          <w:tcPr>
+            <w:tcW w:w="2209" w:type="dxa"/>
+          </w:tcPr>
+          <w:p>
+            <w:r>
+              <w:t>Métrica</w:t>
+            </w:r>
+          </w:p>
+        </w:tc>
+        <w:tc>
+          <w:tcPr>
+            <w:tcW w:w="2209" w:type="dxa"/>
+          </w:tcPr>
+          <w:p>
+            <w:r>
+              <w:t>Bueno</w:t>
+            </w:r>
+          </w:p>
+        </w:tc>
+        <w:tc>
+          <w:tcPr>
+            <w:tcW w:w="2209" w:type="dxa"/>
+          </w:tcPr>
+          <w:p>
+            <w:r>
+              <w:t>Advertencia</w:t>
+            </w:r>
+          </w:p>
+        </w:tc>
+        <w:tc>
+          <w:tcPr>
+            <w:tcW w:w="2209" w:type="dxa"/>
+          </w:tcPr>
+          <w:p>
+            <w:r>
+              <w:t>Crítico</w:t>
+            </w:r>
+          </w:p>
+        </w:tc>
+      </w:tr>
+      <w:tr>
+        <w:tc>
+          <w:tcPr>
+            <w:tcW w:w="2209" w:type="dxa"/>
+          </w:tcPr>
+          <w:p>
+            <w:r>
+              <w:t>RPS (requests/sec)</w:t>
+            </w:r>
+          </w:p>
+        </w:tc>
+        <w:tc>
+          <w:tcPr>
+            <w:tcW w:w="2209" w:type="dxa"/>
+          </w:tcPr>
+          <w:p>
+            <w:r>
+              <w:t>&gt;500</w:t>
+            </w:r>
+          </w:p>
+        </w:tc>
+        <w:tc>
+          <w:tcPr>
+            <w:tcW w:w="2209" w:type="dxa"/>
+          </w:tcPr>
+          <w:p>
+            <w:r>
+              <w:t>100-500</w:t>
+            </w:r>
+          </w:p>
+        </w:tc>
+        <w:tc>
+          <w:tcPr>
+            <w:tcW w:w="2209" w:type="dxa"/>
+          </w:tcPr>
+          <w:p>
+            <w:r>
+              <w:t>&lt;100</w:t>
+            </w:r>
+          </w:p>
+        </w:tc>
+      </w:tr>
+      <w:tr>
+        <w:tc>
+          <w:tcPr>
+            <w:tcW w:w="2209" w:type="dxa"/>
+          </w:tcPr>
+          <w:p>
+            <w:r>
+              <w:t>Tiempo respuesta p95</w:t>
+            </w:r>
+          </w:p>
+        </w:tc>
+        <w:tc>
+          <w:tcPr>
+            <w:tcW w:w="2209" w:type="dxa"/>
+          </w:tcPr>
+          <w:p>
+            <w:r>
+              <w:t>&lt;1s</w:t>
+            </w:r>
+          </w:p>
+        </w:tc>
+        <w:tc>
+          <w:tcPr>
+            <w:tcW w:w="2209" w:type="dxa"/>
+          </w:tcPr>
+          <w:p>
+            <w:r>
+              <w:t>1-3s</w:t>
+            </w:r>
+          </w:p>
+        </w:tc>
+        <w:tc>
+          <w:tcPr>
+            <w:tcW w:w="2209" w:type="dxa"/>
+          </w:tcPr>
+          <w:p>
+            <w:r>
+              <w:t>&gt;3s</w:t>
+            </w:r>
+          </w:p>
+        </w:tc>
+      </w:tr>
+      <w:tr>
+        <w:tc>
+          <w:tcPr>
+            <w:tcW w:w="2209" w:type="dxa"/>
+          </w:tcPr>
+          <w:p>
+            <w:r>
+              <w:t>Tasa de fallos</w:t>
+            </w:r>
+          </w:p>
+        </w:tc>
+        <w:tc>
+          <w:tcPr>
+            <w:tcW w:w="2209" w:type="dxa"/>
+          </w:tcPr>
+          <w:p>
+            <w:r>
+              <w:t>&lt;1%</w:t>
+            </w:r>
+          </w:p>
+        </w:tc>
+        <w:tc>
+          <w:tcPr>
+            <w:tcW w:w="2209" w:type="dxa"/>
+          </w:tcPr>
+          <w:p>
+            <w:r>
+              <w:t>1-5%</w:t>
+            </w:r>
+          </w:p>
+        </w:tc>
+        <w:tc>
+          <w:tcPr>
+            <w:tcW w:w="2209" w:type="dxa"/>
+          </w:tcPr>
+          <w:p>
+            <w:r>
+              <w:t>&gt;5%</w:t>
+            </w:r>
+          </w:p>
+        </w:tc>
+      </w:tr>
+      <w:tr>
+        <w:tc>
+          <w:tcPr>
+            <w:tcW w:w="2209" w:type="dxa"/>
+          </w:tcPr>
+          <w:p>
+            <w:r>
+              <w:t>Page Load (Cypress)</w:t>
+            </w:r>
+          </w:p>
+        </w:tc>
+        <w:tc>
+          <w:tcPr>
+            <w:tcW w:w="2209" w:type="dxa"/>
+          </w:tcPr>
+          <w:p>
+            <w:r>
+              <w:t>&lt;3000ms</w:t>
+            </w:r>
+          </w:p>
+        </w:tc>
+        <w:tc>
+          <w:tcPr>
+            <w:tcW w:w="2209" w:type="dxa"/>
+          </w:tcPr>
+          <w:p>
+            <w:r>
+              <w:t>—</w:t>
+            </w:r>
+          </w:p>
+        </w:tc>
+        <w:tc>
+          <w:tcPr>
+            <w:tcW w:w="2209" w:type="dxa"/>
+          </w:tcPr>
+          <w:p>
+            <w:r>
+              <w:t>&gt;3000ms</w:t>
+            </w:r>
+          </w:p>
+        </w:tc>
+      </w:tr>
+      <w:tr>
+        <w:tc>
+          <w:tcPr>
+            <w:tcW w:w="2209" w:type="dxa"/>
+          </w:tcPr>
+          <w:p>
+            <w:r>
+              <w:t>FCP (Cypress)</w:t>
+            </w:r>
+          </w:p>
+        </w:tc>
+        <w:tc>
+          <w:tcPr>
+            <w:tcW w:w="2209" w:type="dxa"/>
+          </w:tcPr>
+          <w:p>
+            <w:r>
+              <w:t>&lt;1500ms</w:t>
+            </w:r>
+          </w:p>
+        </w:tc>
+        <w:tc>
+          <w:tcPr>
+            <w:tcW w:w="2209" w:type="dxa"/>
+          </w:tcPr>
+          <w:p>
+            <w:r>
+              <w:t>—</w:t>
+            </w:r>
+          </w:p>
+        </w:tc>
+        <w:tc>
+          <w:tcPr>
+            <w:tcW w:w="2209" w:type="dxa"/>
+          </w:tcPr>
+          <w:p>
+            <w:r>
+              <w:t>&gt;1500ms</w:t>
+            </w:r>
+          </w:p>
+        </w:tc>
+      </w:tr>
+    </w:tbl>
+    <w:p>
+      <w:pPr>
+        <w:pStyle w:val="Ttulo3"/>
+      </w:pPr>
+      <w:r>
+        <w:t>18.9 Optimizaciones Implementadas</w:t>
+      </w:r>
+    </w:p>
+    <w:p>
+      <w:r>
+        <w:t>• 13 índices compuestos (60-80% mejora en consultas)</w:t>
+      </w:r>
+    </w:p>
+    <w:p>
+      <w:pPr>
+        <w:rPr>
+          <w:lang w:val="en-US"/>
+        </w:rPr>
+      </w:pPr>
+      <w:r>
+        <w:rPr>
+          <w:lang w:val="en-US"/>
+        </w:rPr>
+        <w:t>• Query cache 256MB e InnoDB buffer pool 1GB</w:t>
+      </w:r>
+    </w:p>
+    <w:p>
+      <w:r>
+        <w:t>• Redis + file fallback cache con TTL inteligente</w:t>
+      </w:r>
+    </w:p>
+    <w:p>
+      <w:r>
+        <w:t>• Browser caching (1 año) y compresión gzip/deflate</w:t>
+      </w:r>
+    </w:p>
+    <w:p>
+      <w:r>
+        <w:t>• Assets locales sin CDN (carga reducida sin DNS+SSL)</w:t>
+      </w:r>
+    </w:p>
+    <w:p>
+      <w:pPr>
+        <w:rPr>
+          <w:lang w:val="en-US"/>
+        </w:rPr>
+      </w:pPr>
+      <w:r>
+        <w:rPr>
+          <w:lang w:val="en-US"/>
+        </w:rPr>
+        <w:t>• Prepared statements nativos y output buffering 4096</w:t>
+      </w:r>
+    </w:p>
+    <w:p>
+      <w:r>
+        <w:t>• OPTIMIZE/ANALYZE TABLE semanal para mantenimiento BD</w:t>
+      </w:r>
+    </w:p>
+    <w:p>
+      <w:pPr>
+        <w:pStyle w:val="Ttulo3"/>
+      </w:pPr>
+      <w:r>
+        <w:lastRenderedPageBreak/>
+        <w:t>18.10 Modelos de Machine Learning</w:t>
+      </w:r>
+    </w:p>
+    <w:p>
+      <w:r>
+        <w:t>MachineLearningEngine implementa: Regresión Lineal, EMA, Regresión Polinomial, LSTM simplificado, K-Means (4 clusters), Random Forest, Naive Bayes y Perceptron. Evaluación: Precisión, Recall, F1-Score, MAE, Matriz de Confusión.</w:t>
+      </w:r>
+    </w:p>
+    <w:p>
+      <w:pPr>
+        <w:pStyle w:val="Ttulo3"/>
+      </w:pPr>
+      <w:r>
+        <w:t>18.11 Brechas y Recomendaciones</w:t>
+      </w:r>
+    </w:p>
+    <w:p>
+      <w:r>
+        <w:t>• Configurar slow query log en MySQL (prioridad: Alta)</w:t>
+      </w:r>
+    </w:p>
+    <w:p>
+      <w:r>
+        <w:t>• Implementar APM (New Relic, Datadog) para trazabilidad completa</w:t>
+      </w:r>
+    </w:p>
+    <w:p>
+      <w:r>
+        <w:t>• Ejecutar load testing periódico y almacenar resultados</w:t>
+      </w:r>
+    </w:p>
+    <w:p>
+      <w:r>
+        <w:t>• Reemplazar cache hit rate hardcodeado (75%) con estadísticas reales</w:t>
+      </w:r>
+    </w:p>
+    <w:p>
+      <w:r>
+        <w:t>• Configurar umbrales dinámicos de alertas basados en líneas base históricas</w:t>
+      </w:r>
+    </w:p>
+    <w:p>
+      <w:pPr>
+        <w:pStyle w:val="Ttulo2"/>
         <w:shd w:val="clear" w:color="auto" w:fill="FFFFFF"/>
         <w:divId w:val="352464823"/>
         <w:rPr>
@@ -15952,7 +17995,7 @@
       </w:pPr>
       <w:r>
         <w:rPr>
-          <w:rStyle w:val="Textoennegrita"/>
+          <w:rStyle w:val="Fuerte"/>
           <w:rFonts w:ascii="Calibri" w:hAnsi="Calibri" w:cs="Calibri"/>
           <w:color w:val="333333"/>
         </w:rPr>
@@ -16137,7 +18180,6 @@
           <w:rFonts w:ascii="Calibri" w:hAnsi="Calibri" w:cs="Calibri"/>
           <w:color w:val="333333"/>
         </w:rPr>
-        <w:lastRenderedPageBreak/>
         <w:t>Con esta arquitectura sólida como base, el sistema puede escalar fácilmente para soportar más dispositivos, empleados, y funcionalidades futuras.</w:t>
       </w:r>
     </w:p>
@@ -16155,7 +18197,7 @@
       </w:pPr>
       <w:r>
         <w:rPr>
-          <w:rStyle w:val="Textoennegrita"/>
+          <w:rStyle w:val="Fuerte"/>
           <w:rFonts w:ascii="Calibri" w:hAnsi="Calibri" w:cs="Calibri"/>
           <w:color w:val="999999"/>
           <w:sz w:val="20"/>
@@ -19506,7 +21548,7 @@
       <w:szCs w:val="22"/>
     </w:rPr>
   </w:style>
-  <w:style w:type="character" w:styleId="Textoennegrita">
+  <w:style w:type="character" w:styleId="Fuerte">
     <w:name w:val="Strong"/>
     <w:basedOn w:val="Fuentedeprrafopredeter"/>
     <w:uiPriority w:val="22"/>

</xml_diff>